<commit_message>
Fix UGA resume spacing to keep one page
Co-Authored-By: Claude Sonnet 5.5 <noreply@anthropic.com>
Claude-Session: https://claude.ai/code/session_01CQFHgEGUEWsGr2fiz5rCwq
</commit_message>
<xml_diff>
--- a/resumes/Resume_UGA_Sukwoo_Chung.docx
+++ b/resumes/Resume_UGA_Sukwoo_Chung.docx
@@ -38,7 +38,7 @@
         <w:pBdr>
           <w:bottom w:val="single" w:sz="4" w:space="1" w:color="auto"/>
         </w:pBdr>
-        <w:spacing w:before="100" w:after="0" w:line="240" w:lineRule="auto"/>
+        <w:spacing w:before="60" w:after="0" w:line="240" w:lineRule="auto"/>
       </w:pPr>
       <w:r>
         <w:rPr>
@@ -195,7 +195,7 @@
         <w:pBdr>
           <w:bottom w:val="single" w:sz="4" w:space="1" w:color="auto"/>
         </w:pBdr>
-        <w:spacing w:before="100" w:after="0" w:line="240" w:lineRule="auto"/>
+        <w:spacing w:before="60" w:after="0" w:line="240" w:lineRule="auto"/>
       </w:pPr>
       <w:r>
         <w:rPr>
@@ -582,7 +582,7 @@
         <w:pBdr>
           <w:bottom w:val="single" w:sz="4" w:space="1" w:color="auto"/>
         </w:pBdr>
-        <w:spacing w:before="100" w:after="0" w:line="240" w:lineRule="auto"/>
+        <w:spacing w:before="60" w:after="0" w:line="240" w:lineRule="auto"/>
       </w:pPr>
       <w:r>
         <w:rPr>
@@ -773,7 +773,7 @@
         <w:pBdr>
           <w:bottom w:val="single" w:sz="4" w:space="1" w:color="auto"/>
         </w:pBdr>
-        <w:spacing w:before="100" w:after="0" w:line="240" w:lineRule="auto"/>
+        <w:spacing w:before="60" w:after="0" w:line="240" w:lineRule="auto"/>
       </w:pPr>
       <w:r>
         <w:rPr>
@@ -940,7 +940,7 @@
         <w:pBdr>
           <w:bottom w:val="single" w:sz="4" w:space="1" w:color="auto"/>
         </w:pBdr>
-        <w:spacing w:before="100" w:after="0" w:line="240" w:lineRule="auto"/>
+        <w:spacing w:before="60" w:after="0" w:line="240" w:lineRule="auto"/>
       </w:pPr>
       <w:r>
         <w:rPr>

</xml_diff>